<commit_message>
Fix duplicated club name for multi-head appointment clause
The reference sample docs/зразок_гурток_створення_2_керівники.docx was
corrected to list co-heads as one shared clause ("Призначити
керівниками гуртка «X» ... спрямування посада1 ..., посада2 ...")
instead of repeating "«X» ... спрямування" for every co-head. The
actual clause text is generated in code (docx_fill only clones list
paragraph styling), so apply the matching fix in
orders.py::_create_clauses.

Co-Authored-By: Claude Sonnet 5 <noreply@anthropic.com>
</commit_message>
<xml_diff>
--- a/docs/зразок_гурток_створення_2_керівники.docx
+++ b/docs/зразок_гурток_створення_2_керівники.docx
@@ -285,7 +285,9 @@
         </w:tblBorders>
         <w:tblLayout w:type="autofit"/>
         <w:tblCellMar>
+          <w:top w:w="0" w:type="dxa"/>
           <w:left w:w="108" w:type="dxa"/>
+          <w:bottom w:w="0" w:type="dxa"/>
           <w:right w:w="108" w:type="dxa"/>
         </w:tblCellMar>
       </w:tblPr>
@@ -304,7 +306,9 @@
             <w:insideV w:val="single" w:color="auto" w:sz="4" w:space="0"/>
           </w:tblBorders>
           <w:tblCellMar>
+            <w:top w:w="0" w:type="dxa"/>
             <w:left w:w="108" w:type="dxa"/>
+            <w:bottom w:w="0" w:type="dxa"/>
             <w:right w:w="108" w:type="dxa"/>
           </w:tblCellMar>
         </w:tblPrEx>
@@ -320,6 +324,7 @@
           </w:tcPr>
           <w:p>
             <w:pPr>
+              <w:widowControl w:val="0"/>
               <w:bidi w:val="0"/>
               <w:jc w:val="both"/>
               <w:rPr>
@@ -358,6 +363,7 @@
           </w:tcPr>
           <w:p>
             <w:pPr>
+              <w:widowControl w:val="0"/>
               <w:wordWrap w:val="0"/>
               <w:bidi w:val="0"/>
               <w:jc w:val="right"/>
@@ -1071,53 +1077,10 @@
           <w:bCs w:val="0"/>
           <w:lang w:val="uk-UA"/>
         </w:rPr>
-        <w:t xml:space="preserve">, </w:t>
-      </w:r>
-      <w:r>
-        <w:rPr>
-          <w:rFonts w:hint="default" w:ascii="Times New Roman" w:hAnsi="Times New Roman" w:cs="Times New Roman"/>
-          <w:b w:val="0"/>
-          <w:bCs w:val="0"/>
-          <w:lang w:val="uk-UA"/>
-        </w:rPr>
-        <w:t>«</w:t>
-      </w:r>
-      <w:r>
-        <w:rPr>
-          <w:rFonts w:hint="default" w:cs="Times New Roman"/>
-          <w:b w:val="0"/>
-          <w:bCs w:val="0"/>
-          <w:lang w:val="en-US"/>
-        </w:rPr>
-        <w:t>&lt;</w:t>
-      </w:r>
-      <w:r>
-        <w:rPr>
-          <w:rFonts w:hint="default" w:cs="Times New Roman"/>
-          <w:b w:val="0"/>
-          <w:bCs w:val="0"/>
-          <w:lang w:val="uk-UA"/>
-        </w:rPr>
-        <w:t>НАЗВА</w:t>
-      </w:r>
-      <w:r>
-        <w:rPr>
-          <w:rFonts w:hint="default" w:cs="Times New Roman"/>
-          <w:b w:val="0"/>
-          <w:bCs w:val="0"/>
-          <w:lang w:val="en-US"/>
-        </w:rPr>
-        <w:t>&gt;</w:t>
-      </w:r>
-      <w:r>
-        <w:rPr>
-          <w:rFonts w:hint="default" w:ascii="Times New Roman" w:hAnsi="Times New Roman" w:cs="Times New Roman"/>
-          <w:b w:val="0"/>
-          <w:bCs w:val="0"/>
-          <w:lang w:val="uk-UA"/>
-        </w:rPr>
-        <w:t>»</w:t>
-      </w:r>
+        <w:t>,</w:t>
+      </w:r>
+      <w:bookmarkStart w:id="0" w:name="_GoBack"/>
+      <w:bookmarkEnd w:id="0"/>
       <w:r>
         <w:rPr>
           <w:rFonts w:hint="default" w:cs="Times New Roman"/>
@@ -1126,42 +1089,6 @@
           <w:lang w:val="uk-UA"/>
         </w:rPr>
         <w:t xml:space="preserve"> </w:t>
-      </w:r>
-      <w:r>
-        <w:rPr>
-          <w:rFonts w:hint="default" w:cs="Times New Roman"/>
-          <w:b w:val="0"/>
-          <w:bCs w:val="0"/>
-          <w:lang w:val="en-US"/>
-        </w:rPr>
-        <w:t>&lt;</w:t>
-      </w:r>
-      <w:r>
-        <w:rPr>
-          <w:rFonts w:hint="default" w:cs="Times New Roman"/>
-          <w:b w:val="0"/>
-          <w:bCs w:val="0"/>
-          <w:lang w:val="uk-UA"/>
-        </w:rPr>
-        <w:t>спрямування</w:t>
-      </w:r>
-      <w:r>
-        <w:rPr>
-          <w:rFonts w:hint="default" w:cs="Times New Roman"/>
-          <w:b w:val="0"/>
-          <w:bCs w:val="0"/>
-          <w:lang w:val="en-US"/>
-        </w:rPr>
-        <w:t>&gt;</w:t>
-      </w:r>
-      <w:r>
-        <w:rPr>
-          <w:rFonts w:hint="default" w:cs="Times New Roman"/>
-          <w:b w:val="0"/>
-          <w:bCs w:val="0"/>
-          <w:lang w:val="uk-UA"/>
-        </w:rPr>
-        <w:t xml:space="preserve"> спрямування </w:t>
       </w:r>
       <w:r>
         <w:rPr>
@@ -1426,6 +1353,7 @@
     <w:p>
       <w:pPr>
         <w:numPr>
+          <w:ilvl w:val="0"/>
           <w:numId w:val="0"/>
         </w:numPr>
         <w:bidi w:val="0"/>
@@ -1441,6 +1369,7 @@
     <w:p>
       <w:pPr>
         <w:numPr>
+          <w:ilvl w:val="0"/>
           <w:numId w:val="0"/>
         </w:numPr>
         <w:bidi w:val="0"/>
@@ -1456,6 +1385,7 @@
     <w:p>
       <w:pPr>
         <w:numPr>
+          <w:ilvl w:val="0"/>
           <w:numId w:val="0"/>
         </w:numPr>
         <w:bidi w:val="0"/>
@@ -1471,6 +1401,7 @@
     <w:p>
       <w:pPr>
         <w:numPr>
+          <w:ilvl w:val="0"/>
           <w:numId w:val="0"/>
         </w:numPr>
         <w:bidi w:val="0"/>
@@ -1498,7 +1429,9 @@
         </w:tblBorders>
         <w:tblLayout w:type="autofit"/>
         <w:tblCellMar>
+          <w:top w:w="0" w:type="dxa"/>
           <w:left w:w="108" w:type="dxa"/>
+          <w:bottom w:w="0" w:type="dxa"/>
           <w:right w:w="108" w:type="dxa"/>
         </w:tblCellMar>
       </w:tblPr>
@@ -1517,7 +1450,9 @@
             <w:insideV w:val="single" w:color="auto" w:sz="4" w:space="0"/>
           </w:tblBorders>
           <w:tblCellMar>
+            <w:top w:w="0" w:type="dxa"/>
             <w:left w:w="108" w:type="dxa"/>
+            <w:bottom w:w="0" w:type="dxa"/>
             <w:right w:w="108" w:type="dxa"/>
           </w:tblCellMar>
         </w:tblPrEx>
@@ -1533,7 +1468,9 @@
           </w:tcPr>
           <w:p>
             <w:pPr>
+              <w:widowControl w:val="0"/>
               <w:numPr>
+                <w:ilvl w:val="0"/>
                 <w:numId w:val="0"/>
               </w:numPr>
               <w:bidi w:val="0"/>
@@ -1590,7 +1527,9 @@
           </w:tcPr>
           <w:p>
             <w:pPr>
+              <w:widowControl w:val="0"/>
               <w:numPr>
+                <w:ilvl w:val="0"/>
                 <w:numId w:val="0"/>
               </w:numPr>
               <w:bidi w:val="0"/>
@@ -1939,6 +1878,12 @@
             <w:insideH w:val="single" w:color="auto" w:sz="4" w:space="0"/>
             <w:insideV w:val="single" w:color="auto" w:sz="4" w:space="0"/>
           </w:tblBorders>
+          <w:tblCellMar>
+            <w:top w:w="0" w:type="dxa"/>
+            <w:left w:w="108" w:type="dxa"/>
+            <w:bottom w:w="0" w:type="dxa"/>
+            <w:right w:w="108" w:type="dxa"/>
+          </w:tblCellMar>
         </w:tblPrEx>
         <w:tc>
           <w:tcPr>
@@ -1952,6 +1897,7 @@
           </w:tcPr>
           <w:p>
             <w:pPr>
+              <w:widowControl w:val="0"/>
               <w:numPr>
                 <w:ilvl w:val="0"/>
                 <w:numId w:val="0"/>
@@ -2019,6 +1965,7 @@
           </w:tcPr>
           <w:p>
             <w:pPr>
+              <w:widowControl w:val="0"/>
               <w:numPr>
                 <w:ilvl w:val="0"/>
                 <w:numId w:val="0"/>
@@ -2104,6 +2051,7 @@
           </w:tcPr>
           <w:p>
             <w:pPr>
+              <w:widowControl w:val="0"/>
               <w:numPr>
                 <w:ilvl w:val="0"/>
                 <w:numId w:val="0"/>
@@ -2147,6 +2095,7 @@
           </w:tcPr>
           <w:p>
             <w:pPr>
+              <w:widowControl w:val="0"/>
               <w:numPr>
                 <w:ilvl w:val="0"/>
                 <w:numId w:val="0"/>
@@ -2232,6 +2181,7 @@
           </w:tcPr>
           <w:p>
             <w:pPr>
+              <w:widowControl w:val="0"/>
               <w:numPr>
                 <w:ilvl w:val="0"/>
                 <w:numId w:val="0"/>
@@ -2275,6 +2225,7 @@
           </w:tcPr>
           <w:p>
             <w:pPr>
+              <w:widowControl w:val="0"/>
               <w:numPr>
                 <w:ilvl w:val="0"/>
                 <w:numId w:val="0"/>
@@ -2563,8 +2514,6 @@
         </w:rPr>
         <w:t>Відділ  кадрів.</w:t>
       </w:r>
-      <w:bookmarkStart w:id="0" w:name="_GoBack"/>
-      <w:bookmarkEnd w:id="0"/>
     </w:p>
     <w:sectPr>
       <w:pgSz w:w="11906" w:h="16838"/>

</xml_diff>